<commit_message>
Utilizando hash , SHA-256 , AES
</commit_message>
<xml_diff>
--- a/archivos word -diario tecnico/📓 Diario de prácticas.docx
+++ b/archivos word -diario tecnico/📓 Diario de prácticas.docx
@@ -1228,7 +1228,7 @@
           <w:sz w:val="16"/>
           <w:szCs w:val="16"/>
         </w:rPr>
-        <w:t>html.escape</w:t>
+        <w:t>html. escape</w:t>
       </w:r>
       <w:r>
         <w:rPr>
@@ -2947,6 +2947,1006 @@
           <w:szCs w:val="16"/>
         </w:rPr>
       </w:pPr>
+    </w:p>
+    <w:p>
+      <w:pPr>
+        <w:spacing w:after="0"/>
+        <w:rPr>
+          <w:rFonts w:ascii="Segoe UI Emoji" w:hAnsi="Segoe UI Emoji" w:cs="Segoe UI Emoji"/>
+          <w:b/>
+          <w:bCs/>
+          <w:sz w:val="16"/>
+          <w:szCs w:val="16"/>
+        </w:rPr>
+      </w:pPr>
+      <w:r>
+        <w:rPr>
+          <w:rFonts w:ascii="Segoe UI Emoji" w:hAnsi="Segoe UI Emoji" w:cs="Segoe UI Emoji"/>
+          <w:b/>
+          <w:bCs/>
+          <w:sz w:val="16"/>
+          <w:szCs w:val="16"/>
+        </w:rPr>
+        <w:t xml:space="preserve">Fecha: </w:t>
+      </w:r>
+      <w:r>
+        <w:rPr>
+          <w:rFonts w:ascii="Segoe UI Emoji" w:hAnsi="Segoe UI Emoji" w:cs="Segoe UI Emoji"/>
+          <w:b/>
+          <w:bCs/>
+          <w:sz w:val="16"/>
+          <w:szCs w:val="16"/>
+        </w:rPr>
+        <w:t>4</w:t>
+      </w:r>
+      <w:r>
+        <w:rPr>
+          <w:rFonts w:ascii="Segoe UI Emoji" w:hAnsi="Segoe UI Emoji" w:cs="Segoe UI Emoji"/>
+          <w:b/>
+          <w:bCs/>
+          <w:sz w:val="16"/>
+          <w:szCs w:val="16"/>
+        </w:rPr>
+        <w:t>/03/2026</w:t>
+      </w:r>
+    </w:p>
+    <w:p>
+      <w:pPr>
+        <w:spacing w:after="0"/>
+        <w:rPr>
+          <w:rFonts w:ascii="Segoe UI Emoji" w:hAnsi="Segoe UI Emoji"/>
+          <w:b/>
+          <w:bCs/>
+          <w:sz w:val="16"/>
+          <w:szCs w:val="16"/>
+        </w:rPr>
+      </w:pPr>
+      <w:r>
+        <w:rPr>
+          <w:rFonts w:ascii="Segoe UI Emoji" w:hAnsi="Segoe UI Emoji"/>
+          <w:b/>
+          <w:bCs/>
+          <w:sz w:val="16"/>
+          <w:szCs w:val="16"/>
+        </w:rPr>
+        <w:t>Acción realizada</w:t>
+      </w:r>
+      <w:r>
+        <w:rPr>
+          <w:rFonts w:ascii="Segoe UI Emoji" w:hAnsi="Segoe UI Emoji"/>
+          <w:b/>
+          <w:bCs/>
+          <w:sz w:val="16"/>
+          <w:szCs w:val="16"/>
+        </w:rPr>
+        <w:t xml:space="preserve"> – </w:t>
+      </w:r>
+      <w:r>
+        <w:rPr>
+          <w:rFonts w:ascii="Segoe UI Emoji" w:hAnsi="Segoe UI Emoji"/>
+          <w:b/>
+          <w:bCs/>
+          <w:sz w:val="16"/>
+          <w:szCs w:val="16"/>
+          <w:highlight w:val="yellow"/>
+        </w:rPr>
+        <w:t>Utilización de Bcrypt para transformar contraseña en hash segura</w:t>
+      </w:r>
+    </w:p>
+    <w:p>
+      <w:pPr>
+        <w:spacing w:after="0"/>
+        <w:rPr>
+          <w:rFonts w:ascii="Segoe UI Emoji" w:hAnsi="Segoe UI Emoji"/>
+          <w:sz w:val="16"/>
+          <w:szCs w:val="16"/>
+        </w:rPr>
+      </w:pPr>
+      <w:r>
+        <w:rPr>
+          <w:rFonts w:ascii="Segoe UI Emoji" w:hAnsi="Segoe UI Emoji"/>
+          <w:sz w:val="16"/>
+          <w:szCs w:val="16"/>
+        </w:rPr>
+        <w:t xml:space="preserve">• </w:t>
+      </w:r>
+      <w:r>
+        <w:rPr>
+          <w:rFonts w:ascii="Segoe UI Emoji" w:hAnsi="Segoe UI Emoji"/>
+          <w:sz w:val="16"/>
+          <w:szCs w:val="16"/>
+        </w:rPr>
+        <w:tab/>
+        <w:t xml:space="preserve">Refactorizamos el </w:t>
+      </w:r>
+      <w:r>
+        <w:rPr>
+          <w:rFonts w:ascii="Segoe UI Emoji" w:hAnsi="Segoe UI Emoji"/>
+          <w:sz w:val="16"/>
+          <w:szCs w:val="16"/>
+        </w:rPr>
+        <w:t xml:space="preserve">endpoint </w:t>
+      </w:r>
+      <w:r>
+        <w:rPr>
+          <w:rFonts w:ascii="Segoe UI Emoji" w:hAnsi="Segoe UI Emoji"/>
+          <w:sz w:val="16"/>
+          <w:szCs w:val="16"/>
+        </w:rPr>
+        <w:t>/</w:t>
+      </w:r>
+      <w:r>
+        <w:rPr>
+          <w:rFonts w:ascii="Segoe UI Emoji" w:hAnsi="Segoe UI Emoji"/>
+          <w:sz w:val="16"/>
+          <w:szCs w:val="16"/>
+          <w:highlight w:val="yellow"/>
+        </w:rPr>
+        <w:t>login</w:t>
+      </w:r>
+      <w:r>
+        <w:rPr>
+          <w:rFonts w:ascii="Segoe UI Emoji" w:hAnsi="Segoe UI Emoji"/>
+          <w:sz w:val="16"/>
+          <w:szCs w:val="16"/>
+        </w:rPr>
+        <w:t xml:space="preserve"> </w:t>
+      </w:r>
+      <w:r>
+        <w:rPr>
+          <w:rFonts w:ascii="Segoe UI Emoji" w:hAnsi="Segoe UI Emoji"/>
+          <w:sz w:val="16"/>
+          <w:szCs w:val="16"/>
+        </w:rPr>
+        <w:t>en</w:t>
+      </w:r>
+      <w:r>
+        <w:rPr>
+          <w:rFonts w:ascii="Segoe UI Emoji" w:hAnsi="Segoe UI Emoji"/>
+          <w:sz w:val="16"/>
+          <w:szCs w:val="16"/>
+        </w:rPr>
+        <w:t xml:space="preserve"> método POST para dejar de usar contraseñas en texto plano.</w:t>
+      </w:r>
+    </w:p>
+    <w:p>
+      <w:pPr>
+        <w:spacing w:after="0"/>
+        <w:rPr>
+          <w:rFonts w:ascii="Segoe UI Emoji" w:hAnsi="Segoe UI Emoji"/>
+          <w:sz w:val="16"/>
+          <w:szCs w:val="16"/>
+        </w:rPr>
+      </w:pPr>
+      <w:r>
+        <w:rPr>
+          <w:rFonts w:ascii="Segoe UI Emoji" w:hAnsi="Segoe UI Emoji"/>
+          <w:sz w:val="16"/>
+          <w:szCs w:val="16"/>
+        </w:rPr>
+        <w:lastRenderedPageBreak/>
+        <w:t xml:space="preserve">• </w:t>
+      </w:r>
+      <w:r>
+        <w:rPr>
+          <w:rFonts w:ascii="Segoe UI Emoji" w:hAnsi="Segoe UI Emoji"/>
+          <w:sz w:val="16"/>
+          <w:szCs w:val="16"/>
+        </w:rPr>
+        <w:tab/>
+        <w:t>Generamos un hash bcrypt de la contraseña en un script aparte y lo almacenamos en el servidor.</w:t>
+      </w:r>
+    </w:p>
+    <w:p>
+      <w:pPr>
+        <w:spacing w:after="0"/>
+        <w:rPr>
+          <w:rFonts w:ascii="Segoe UI Emoji" w:hAnsi="Segoe UI Emoji"/>
+          <w:sz w:val="16"/>
+          <w:szCs w:val="16"/>
+        </w:rPr>
+      </w:pPr>
+      <w:r>
+        <w:rPr>
+          <w:rFonts w:ascii="Segoe UI Emoji" w:hAnsi="Segoe UI Emoji"/>
+          <w:sz w:val="16"/>
+          <w:szCs w:val="16"/>
+        </w:rPr>
+        <w:t xml:space="preserve">• </w:t>
+      </w:r>
+      <w:r>
+        <w:rPr>
+          <w:rFonts w:ascii="Segoe UI Emoji" w:hAnsi="Segoe UI Emoji"/>
+          <w:sz w:val="16"/>
+          <w:szCs w:val="16"/>
+        </w:rPr>
+        <w:tab/>
+        <w:t xml:space="preserve">Integramos la librería </w:t>
+      </w:r>
+      <w:r>
+        <w:rPr>
+          <w:rFonts w:ascii="Segoe UI Emoji" w:hAnsi="Segoe UI Emoji"/>
+          <w:sz w:val="16"/>
+          <w:szCs w:val="16"/>
+        </w:rPr>
+        <w:t>bcrypt</w:t>
+      </w:r>
+      <w:r>
+        <w:rPr>
+          <w:rFonts w:ascii="Segoe UI Emoji" w:hAnsi="Segoe UI Emoji"/>
+          <w:sz w:val="16"/>
+          <w:szCs w:val="16"/>
+        </w:rPr>
+        <w:t xml:space="preserve"> en</w:t>
+      </w:r>
+      <w:r>
+        <w:rPr>
+          <w:rFonts w:ascii="Segoe UI Emoji" w:hAnsi="Segoe UI Emoji"/>
+          <w:sz w:val="16"/>
+          <w:szCs w:val="16"/>
+        </w:rPr>
+        <w:t xml:space="preserve"> server_https.py</w:t>
+      </w:r>
+      <w:r>
+        <w:rPr>
+          <w:rFonts w:ascii="Segoe UI Emoji" w:hAnsi="Segoe UI Emoji"/>
+          <w:sz w:val="16"/>
+          <w:szCs w:val="16"/>
+        </w:rPr>
+        <w:t xml:space="preserve"> y</w:t>
+      </w:r>
+      <w:r>
+        <w:rPr>
+          <w:rFonts w:ascii="Segoe UI Emoji" w:hAnsi="Segoe UI Emoji"/>
+          <w:sz w:val="16"/>
+          <w:szCs w:val="16"/>
+        </w:rPr>
+        <w:t xml:space="preserve"> reemplazamos la validación simple </w:t>
+      </w:r>
+      <w:r>
+        <w:rPr>
+          <w:rFonts w:ascii="Segoe UI Emoji" w:hAnsi="Segoe UI Emoji"/>
+          <w:sz w:val="16"/>
+          <w:szCs w:val="16"/>
+        </w:rPr>
+        <w:t>por</w:t>
+      </w:r>
+      <w:r>
+        <w:rPr>
+          <w:rFonts w:ascii="Segoe UI Emoji" w:hAnsi="Segoe UI Emoji"/>
+          <w:sz w:val="16"/>
+          <w:szCs w:val="16"/>
+        </w:rPr>
+        <w:t xml:space="preserve"> bcrypt. checkpw ()</w:t>
+      </w:r>
+      <w:r>
+        <w:rPr>
+          <w:rFonts w:ascii="Segoe UI Emoji" w:hAnsi="Segoe UI Emoji"/>
+          <w:sz w:val="16"/>
+          <w:szCs w:val="16"/>
+        </w:rPr>
+        <w:t>.</w:t>
+      </w:r>
+    </w:p>
+    <w:p>
+      <w:pPr>
+        <w:spacing w:after="0"/>
+        <w:rPr>
+          <w:rFonts w:ascii="Segoe UI Emoji" w:hAnsi="Segoe UI Emoji"/>
+          <w:sz w:val="16"/>
+          <w:szCs w:val="16"/>
+        </w:rPr>
+      </w:pPr>
+      <w:r>
+        <w:rPr>
+          <w:rFonts w:ascii="Segoe UI Emoji" w:hAnsi="Segoe UI Emoji"/>
+          <w:sz w:val="16"/>
+          <w:szCs w:val="16"/>
+        </w:rPr>
+        <w:t xml:space="preserve">• </w:t>
+      </w:r>
+      <w:r>
+        <w:rPr>
+          <w:rFonts w:ascii="Segoe UI Emoji" w:hAnsi="Segoe UI Emoji"/>
+          <w:sz w:val="16"/>
+          <w:szCs w:val="16"/>
+        </w:rPr>
+        <w:tab/>
+        <w:t>Probamos el login en el navegador (</w:t>
+      </w:r>
+      <w:r>
+        <w:rPr>
+          <w:rFonts w:ascii="Segoe UI Emoji" w:hAnsi="Segoe UI Emoji"/>
+          <w:sz w:val="16"/>
+          <w:szCs w:val="16"/>
+        </w:rPr>
+        <w:t>https://localhost:4443/login</w:t>
+      </w:r>
+      <w:r>
+        <w:rPr>
+          <w:rFonts w:ascii="Segoe UI Emoji" w:hAnsi="Segoe UI Emoji"/>
+          <w:sz w:val="16"/>
+          <w:szCs w:val="16"/>
+        </w:rPr>
+        <w:t>) con usuario</w:t>
+      </w:r>
+      <w:r>
+        <w:rPr>
+          <w:rFonts w:ascii="Segoe UI Emoji" w:hAnsi="Segoe UI Emoji"/>
+          <w:sz w:val="16"/>
+          <w:szCs w:val="16"/>
+        </w:rPr>
+        <w:t xml:space="preserve"> admin</w:t>
+      </w:r>
+      <w:r>
+        <w:rPr>
+          <w:rFonts w:ascii="Segoe UI Emoji" w:hAnsi="Segoe UI Emoji"/>
+          <w:sz w:val="16"/>
+          <w:szCs w:val="16"/>
+        </w:rPr>
+        <w:t xml:space="preserve"> y</w:t>
+      </w:r>
+      <w:r>
+        <w:rPr>
+          <w:rFonts w:ascii="Segoe UI Emoji" w:hAnsi="Segoe UI Emoji"/>
+          <w:sz w:val="16"/>
+          <w:szCs w:val="16"/>
+        </w:rPr>
+        <w:t xml:space="preserve"> contraseña correcta.</w:t>
+      </w:r>
+    </w:p>
+    <w:p>
+      <w:pPr>
+        <w:spacing w:after="0"/>
+        <w:rPr>
+          <w:rFonts w:ascii="Segoe UI Emoji" w:hAnsi="Segoe UI Emoji"/>
+          <w:sz w:val="16"/>
+          <w:szCs w:val="16"/>
+        </w:rPr>
+      </w:pPr>
+    </w:p>
+    <w:p>
+      <w:pPr>
+        <w:spacing w:after="0"/>
+        <w:rPr>
+          <w:rFonts w:ascii="Segoe UI Emoji" w:hAnsi="Segoe UI Emoji"/>
+          <w:b/>
+          <w:bCs/>
+          <w:sz w:val="16"/>
+          <w:szCs w:val="16"/>
+        </w:rPr>
+      </w:pPr>
+      <w:r>
+        <w:rPr>
+          <w:rFonts w:ascii="Segoe UI Emoji" w:hAnsi="Segoe UI Emoji"/>
+          <w:b/>
+          <w:bCs/>
+          <w:sz w:val="16"/>
+          <w:szCs w:val="16"/>
+        </w:rPr>
+        <w:t>Resultado</w:t>
+      </w:r>
+    </w:p>
+    <w:p>
+      <w:pPr>
+        <w:spacing w:after="0"/>
+        <w:rPr>
+          <w:rFonts w:ascii="Segoe UI Emoji" w:hAnsi="Segoe UI Emoji"/>
+          <w:sz w:val="16"/>
+          <w:szCs w:val="16"/>
+        </w:rPr>
+      </w:pPr>
+      <w:r>
+        <w:rPr>
+          <w:rFonts w:ascii="Segoe UI Emoji" w:hAnsi="Segoe UI Emoji"/>
+          <w:sz w:val="16"/>
+          <w:szCs w:val="16"/>
+        </w:rPr>
+        <w:t xml:space="preserve">• </w:t>
+      </w:r>
+      <w:r>
+        <w:rPr>
+          <w:rFonts w:ascii="Segoe UI Emoji" w:hAnsi="Segoe UI Emoji"/>
+          <w:sz w:val="16"/>
+          <w:szCs w:val="16"/>
+        </w:rPr>
+        <w:tab/>
+        <w:t>El servidor valida correctamente la contraseña contra el hash almacenado.</w:t>
+      </w:r>
+    </w:p>
+    <w:p>
+      <w:pPr>
+        <w:spacing w:after="0"/>
+        <w:rPr>
+          <w:rFonts w:ascii="Segoe UI Emoji" w:hAnsi="Segoe UI Emoji"/>
+          <w:sz w:val="16"/>
+          <w:szCs w:val="16"/>
+        </w:rPr>
+      </w:pPr>
+      <w:r>
+        <w:rPr>
+          <w:rFonts w:ascii="Segoe UI Emoji" w:hAnsi="Segoe UI Emoji"/>
+          <w:sz w:val="16"/>
+          <w:szCs w:val="16"/>
+        </w:rPr>
+        <w:t xml:space="preserve">• </w:t>
+      </w:r>
+      <w:r>
+        <w:rPr>
+          <w:rFonts w:ascii="Segoe UI Emoji" w:hAnsi="Segoe UI Emoji"/>
+          <w:sz w:val="16"/>
+          <w:szCs w:val="16"/>
+        </w:rPr>
+        <w:tab/>
+        <w:t>Login exitoso solo si la contraseña coincide con el hash → muestra “Login exitoso ✅”.</w:t>
+      </w:r>
+    </w:p>
+    <w:p>
+      <w:pPr>
+        <w:spacing w:after="0"/>
+        <w:rPr>
+          <w:rFonts w:ascii="Segoe UI Emoji" w:hAnsi="Segoe UI Emoji"/>
+          <w:sz w:val="16"/>
+          <w:szCs w:val="16"/>
+        </w:rPr>
+      </w:pPr>
+      <w:r>
+        <w:rPr>
+          <w:rFonts w:ascii="Segoe UI Emoji" w:hAnsi="Segoe UI Emoji"/>
+          <w:sz w:val="16"/>
+          <w:szCs w:val="16"/>
+        </w:rPr>
+        <w:t xml:space="preserve">• </w:t>
+      </w:r>
+      <w:r>
+        <w:rPr>
+          <w:rFonts w:ascii="Segoe UI Emoji" w:hAnsi="Segoe UI Emoji"/>
+          <w:sz w:val="16"/>
+          <w:szCs w:val="16"/>
+        </w:rPr>
+        <w:tab/>
+        <w:t>Login incorrecto → devuelve “Credenciales inválidas ❌”.</w:t>
+      </w:r>
+    </w:p>
+    <w:p>
+      <w:pPr>
+        <w:spacing w:after="0"/>
+        <w:rPr>
+          <w:rFonts w:ascii="Segoe UI Emoji" w:hAnsi="Segoe UI Emoji"/>
+          <w:sz w:val="16"/>
+          <w:szCs w:val="16"/>
+        </w:rPr>
+      </w:pPr>
+      <w:r>
+        <w:rPr>
+          <w:rFonts w:ascii="Segoe UI Emoji" w:hAnsi="Segoe UI Emoji"/>
+          <w:sz w:val="16"/>
+          <w:szCs w:val="16"/>
+        </w:rPr>
+        <w:t xml:space="preserve">• </w:t>
+      </w:r>
+      <w:r>
+        <w:rPr>
+          <w:rFonts w:ascii="Segoe UI Emoji" w:hAnsi="Segoe UI Emoji"/>
+          <w:sz w:val="16"/>
+          <w:szCs w:val="16"/>
+        </w:rPr>
+        <w:tab/>
+        <w:t>Confirmamos que el flujo de sesión, cookie segura y CSRF siguen funcionando igual, pero ahora con contraseñas protegidas.</w:t>
+      </w:r>
+    </w:p>
+    <w:p>
+      <w:pPr>
+        <w:spacing w:after="0"/>
+        <w:rPr>
+          <w:rFonts w:ascii="Segoe UI Emoji" w:hAnsi="Segoe UI Emoji"/>
+          <w:sz w:val="16"/>
+          <w:szCs w:val="16"/>
+        </w:rPr>
+      </w:pPr>
+    </w:p>
+    <w:p>
+      <w:pPr>
+        <w:spacing w:after="0"/>
+        <w:rPr>
+          <w:rFonts w:ascii="Segoe UI Emoji" w:hAnsi="Segoe UI Emoji"/>
+          <w:b/>
+          <w:bCs/>
+          <w:sz w:val="16"/>
+          <w:szCs w:val="16"/>
+        </w:rPr>
+      </w:pPr>
+      <w:r>
+        <w:rPr>
+          <w:rFonts w:ascii="Segoe UI Emoji" w:hAnsi="Segoe UI Emoji"/>
+          <w:b/>
+          <w:bCs/>
+          <w:sz w:val="16"/>
+          <w:szCs w:val="16"/>
+        </w:rPr>
+        <w:t>Reflexión</w:t>
+      </w:r>
+    </w:p>
+    <w:p>
+      <w:pPr>
+        <w:spacing w:after="0"/>
+        <w:rPr>
+          <w:rFonts w:ascii="Segoe UI Emoji" w:hAnsi="Segoe UI Emoji"/>
+          <w:sz w:val="16"/>
+          <w:szCs w:val="16"/>
+        </w:rPr>
+      </w:pPr>
+      <w:r>
+        <w:rPr>
+          <w:rFonts w:ascii="Segoe UI Emoji" w:hAnsi="Segoe UI Emoji"/>
+          <w:sz w:val="16"/>
+          <w:szCs w:val="16"/>
+        </w:rPr>
+        <w:t xml:space="preserve">• </w:t>
+      </w:r>
+      <w:r>
+        <w:rPr>
+          <w:rFonts w:ascii="Segoe UI Emoji" w:hAnsi="Segoe UI Emoji"/>
+          <w:sz w:val="16"/>
+          <w:szCs w:val="16"/>
+        </w:rPr>
+        <w:tab/>
+        <w:t>Aprendí que en sistemas reales el servidor nunca guarda contraseñas en texto plano, sino hashes seguros (bcrypt, Argon2, etc.).</w:t>
+      </w:r>
+    </w:p>
+    <w:p>
+      <w:pPr>
+        <w:spacing w:after="0"/>
+        <w:rPr>
+          <w:rFonts w:ascii="Segoe UI Emoji" w:hAnsi="Segoe UI Emoji"/>
+          <w:sz w:val="16"/>
+          <w:szCs w:val="16"/>
+        </w:rPr>
+      </w:pPr>
+      <w:r>
+        <w:rPr>
+          <w:rFonts w:ascii="Segoe UI Emoji" w:hAnsi="Segoe UI Emoji"/>
+          <w:sz w:val="16"/>
+          <w:szCs w:val="16"/>
+        </w:rPr>
+        <w:t xml:space="preserve">• </w:t>
+      </w:r>
+      <w:r>
+        <w:rPr>
+          <w:rFonts w:ascii="Segoe UI Emoji" w:hAnsi="Segoe UI Emoji"/>
+          <w:sz w:val="16"/>
+          <w:szCs w:val="16"/>
+        </w:rPr>
+        <w:tab/>
+        <w:t>El navegador envía la contraseña por HTTPS, y el servidor la compara contra el hash almacenado.</w:t>
+      </w:r>
+    </w:p>
+    <w:p>
+      <w:pPr>
+        <w:spacing w:after="0"/>
+        <w:rPr>
+          <w:rFonts w:ascii="Segoe UI Emoji" w:hAnsi="Segoe UI Emoji"/>
+          <w:sz w:val="16"/>
+          <w:szCs w:val="16"/>
+        </w:rPr>
+      </w:pPr>
+      <w:r>
+        <w:rPr>
+          <w:rFonts w:ascii="Segoe UI Emoji" w:hAnsi="Segoe UI Emoji"/>
+          <w:sz w:val="16"/>
+          <w:szCs w:val="16"/>
+        </w:rPr>
+        <w:t xml:space="preserve">• </w:t>
+      </w:r>
+      <w:r>
+        <w:rPr>
+          <w:rFonts w:ascii="Segoe UI Emoji" w:hAnsi="Segoe UI Emoji"/>
+          <w:sz w:val="16"/>
+          <w:szCs w:val="16"/>
+        </w:rPr>
+        <w:tab/>
+        <w:t>Bcrypt añade salt y un factor de costo, lo que hace que las contraseñas sean mucho más resistentes a ataques de fuerza bruta.</w:t>
+      </w:r>
+    </w:p>
+    <w:p>
+      <w:pPr>
+        <w:spacing w:after="0"/>
+        <w:rPr>
+          <w:rFonts w:ascii="Segoe UI Emoji" w:hAnsi="Segoe UI Emoji"/>
+          <w:sz w:val="16"/>
+          <w:szCs w:val="16"/>
+        </w:rPr>
+      </w:pPr>
+      <w:r>
+        <w:rPr>
+          <w:rFonts w:ascii="Segoe UI Emoji" w:hAnsi="Segoe UI Emoji"/>
+          <w:sz w:val="16"/>
+          <w:szCs w:val="16"/>
+        </w:rPr>
+        <w:t xml:space="preserve">• </w:t>
+      </w:r>
+      <w:r>
+        <w:rPr>
+          <w:rFonts w:ascii="Segoe UI Emoji" w:hAnsi="Segoe UI Emoji"/>
+          <w:sz w:val="16"/>
+          <w:szCs w:val="16"/>
+        </w:rPr>
+        <w:tab/>
+        <w:t>Este cambio acerca mi laboratorio a un entorno real de producción, reforzando la seguridad del login</w:t>
+      </w:r>
+      <w:r>
+        <w:rPr>
+          <w:rFonts w:ascii="Segoe UI Emoji" w:hAnsi="Segoe UI Emoji"/>
+          <w:sz w:val="16"/>
+          <w:szCs w:val="16"/>
+        </w:rPr>
+        <w:t>.</w:t>
+      </w:r>
+    </w:p>
+    <w:p>
+      <w:pPr>
+        <w:spacing w:after="0"/>
+        <w:rPr>
+          <w:b/>
+          <w:bCs/>
+          <w:u w:val="single"/>
+        </w:rPr>
+      </w:pPr>
+    </w:p>
+    <w:p>
+      <w:pPr>
+        <w:spacing w:after="0"/>
+        <w:rPr>
+          <w:rFonts w:ascii="Segoe UI Emoji" w:hAnsi="Segoe UI Emoji" w:cs="Segoe UI Emoji"/>
+          <w:b/>
+          <w:bCs/>
+          <w:sz w:val="16"/>
+          <w:szCs w:val="16"/>
+        </w:rPr>
+      </w:pPr>
+      <w:r>
+        <w:rPr>
+          <w:rFonts w:ascii="Segoe UI Emoji" w:hAnsi="Segoe UI Emoji" w:cs="Segoe UI Emoji"/>
+          <w:b/>
+          <w:bCs/>
+          <w:sz w:val="16"/>
+          <w:szCs w:val="16"/>
+        </w:rPr>
+        <w:t>Fecha: 4/03/2026</w:t>
+      </w:r>
+    </w:p>
+    <w:p>
+      <w:pPr>
+        <w:spacing w:after="0"/>
+        <w:rPr>
+          <w:rFonts w:ascii="Segoe UI Emoji" w:hAnsi="Segoe UI Emoji"/>
+          <w:b/>
+          <w:bCs/>
+          <w:sz w:val="16"/>
+          <w:szCs w:val="16"/>
+        </w:rPr>
+      </w:pPr>
+      <w:r>
+        <w:rPr>
+          <w:rFonts w:ascii="Segoe UI Emoji" w:hAnsi="Segoe UI Emoji"/>
+          <w:b/>
+          <w:bCs/>
+          <w:sz w:val="16"/>
+          <w:szCs w:val="16"/>
+        </w:rPr>
+        <w:t>Acción realizada</w:t>
+      </w:r>
+      <w:r>
+        <w:rPr>
+          <w:rFonts w:ascii="Segoe UI Emoji" w:hAnsi="Segoe UI Emoji"/>
+          <w:b/>
+          <w:bCs/>
+          <w:sz w:val="16"/>
+          <w:szCs w:val="16"/>
+        </w:rPr>
+        <w:t xml:space="preserve"> – </w:t>
+      </w:r>
+      <w:r>
+        <w:rPr>
+          <w:rFonts w:ascii="Segoe UI Emoji" w:hAnsi="Segoe UI Emoji"/>
+          <w:b/>
+          <w:bCs/>
+          <w:sz w:val="16"/>
+          <w:szCs w:val="16"/>
+          <w:highlight w:val="yellow"/>
+        </w:rPr>
+        <w:t xml:space="preserve">Reemplazo la generación de tokens </w:t>
+      </w:r>
+      <w:r>
+        <w:rPr>
+          <w:rFonts w:ascii="Segoe UI Emoji" w:hAnsi="Segoe UI Emoji"/>
+          <w:b/>
+          <w:bCs/>
+          <w:sz w:val="16"/>
+          <w:szCs w:val="16"/>
+          <w:highlight w:val="yellow"/>
+        </w:rPr>
+        <w:t>CSRF</w:t>
+      </w:r>
+      <w:r>
+        <w:rPr>
+          <w:rFonts w:ascii="Segoe UI Emoji" w:hAnsi="Segoe UI Emoji"/>
+          <w:b/>
+          <w:bCs/>
+          <w:sz w:val="16"/>
+          <w:szCs w:val="16"/>
+          <w:highlight w:val="yellow"/>
+        </w:rPr>
+        <w:t xml:space="preserve"> simples por tokens basados en SHA-256</w:t>
+      </w:r>
+    </w:p>
+    <w:p>
+      <w:pPr>
+        <w:spacing w:after="0"/>
+        <w:rPr>
+          <w:rFonts w:ascii="Segoe UI Emoji" w:hAnsi="Segoe UI Emoji"/>
+          <w:sz w:val="16"/>
+          <w:szCs w:val="16"/>
+        </w:rPr>
+      </w:pPr>
+      <w:r>
+        <w:rPr>
+          <w:rFonts w:ascii="Segoe UI Emoji" w:hAnsi="Segoe UI Emoji"/>
+          <w:sz w:val="16"/>
+          <w:szCs w:val="16"/>
+        </w:rPr>
+        <w:t xml:space="preserve">  Reemplacé la generación de tokens CSRF simples (</w:t>
+      </w:r>
+      <w:r>
+        <w:rPr>
+          <w:rFonts w:ascii="Segoe UI Emoji" w:hAnsi="Segoe UI Emoji"/>
+          <w:sz w:val="16"/>
+          <w:szCs w:val="16"/>
+        </w:rPr>
+        <w:t>secrets. token</w:t>
+      </w:r>
+      <w:r>
+        <w:rPr>
+          <w:rFonts w:ascii="Segoe UI Emoji" w:hAnsi="Segoe UI Emoji"/>
+          <w:sz w:val="16"/>
+          <w:szCs w:val="16"/>
+        </w:rPr>
+        <w:t xml:space="preserve">_hex) por tokens basados en </w:t>
+      </w:r>
+      <w:r>
+        <w:rPr>
+          <w:rFonts w:ascii="Segoe UI Emoji" w:hAnsi="Segoe UI Emoji"/>
+          <w:b/>
+          <w:bCs/>
+          <w:sz w:val="16"/>
+          <w:szCs w:val="16"/>
+        </w:rPr>
+        <w:t>SHA-256</w:t>
+      </w:r>
+      <w:r>
+        <w:rPr>
+          <w:rFonts w:ascii="Segoe UI Emoji" w:hAnsi="Segoe UI Emoji"/>
+          <w:sz w:val="16"/>
+          <w:szCs w:val="16"/>
+        </w:rPr>
+        <w:t>.</w:t>
+      </w:r>
+    </w:p>
+    <w:p>
+      <w:pPr>
+        <w:numPr>
+          <w:ilvl w:val="0"/>
+          <w:numId w:val="26"/>
+        </w:numPr>
+        <w:spacing w:after="0"/>
+        <w:rPr>
+          <w:rFonts w:ascii="Segoe UI Emoji" w:hAnsi="Segoe UI Emoji"/>
+          <w:sz w:val="16"/>
+          <w:szCs w:val="16"/>
+        </w:rPr>
+      </w:pPr>
+      <w:r>
+        <w:rPr>
+          <w:rFonts w:ascii="Segoe UI Emoji" w:hAnsi="Segoe UI Emoji"/>
+          <w:sz w:val="16"/>
+          <w:szCs w:val="16"/>
+        </w:rPr>
+        <w:t>Modifiqué create_session para generar tokens robustos y únicos.</w:t>
+      </w:r>
+    </w:p>
+    <w:p>
+      <w:pPr>
+        <w:numPr>
+          <w:ilvl w:val="0"/>
+          <w:numId w:val="26"/>
+        </w:numPr>
+        <w:spacing w:after="0"/>
+        <w:rPr>
+          <w:rFonts w:ascii="Segoe UI Emoji" w:hAnsi="Segoe UI Emoji"/>
+          <w:sz w:val="16"/>
+          <w:szCs w:val="16"/>
+        </w:rPr>
+      </w:pPr>
+      <w:r>
+        <w:rPr>
+          <w:rFonts w:ascii="Segoe UI Emoji" w:hAnsi="Segoe UI Emoji"/>
+          <w:sz w:val="16"/>
+          <w:szCs w:val="16"/>
+        </w:rPr>
+        <w:t>Ajusté la validación en /transfer para comparar el token enviado con el esperado.</w:t>
+      </w:r>
+    </w:p>
+    <w:p>
+      <w:pPr>
+        <w:spacing w:after="0"/>
+        <w:rPr>
+          <w:rFonts w:ascii="Segoe UI Emoji" w:hAnsi="Segoe UI Emoji"/>
+          <w:sz w:val="16"/>
+          <w:szCs w:val="16"/>
+        </w:rPr>
+      </w:pPr>
+      <w:r>
+        <w:rPr>
+          <w:rFonts w:ascii="Segoe UI Emoji" w:hAnsi="Segoe UI Emoji"/>
+          <w:b/>
+          <w:bCs/>
+          <w:sz w:val="16"/>
+          <w:szCs w:val="16"/>
+        </w:rPr>
+        <w:t>Resultado</w:t>
+      </w:r>
+    </w:p>
+    <w:p>
+      <w:pPr>
+        <w:numPr>
+          <w:ilvl w:val="0"/>
+          <w:numId w:val="27"/>
+        </w:numPr>
+        <w:spacing w:after="0"/>
+        <w:rPr>
+          <w:rFonts w:ascii="Segoe UI Emoji" w:hAnsi="Segoe UI Emoji"/>
+          <w:sz w:val="16"/>
+          <w:szCs w:val="16"/>
+        </w:rPr>
+      </w:pPr>
+      <w:r>
+        <w:rPr>
+          <w:rFonts w:ascii="Segoe UI Emoji" w:hAnsi="Segoe UI Emoji"/>
+          <w:sz w:val="16"/>
+          <w:szCs w:val="16"/>
+        </w:rPr>
+        <w:t>El endpoint /transfer ahora solo acepta solicitudes con tokens válidos generados por el servidor.</w:t>
+      </w:r>
+    </w:p>
+    <w:p>
+      <w:pPr>
+        <w:numPr>
+          <w:ilvl w:val="0"/>
+          <w:numId w:val="27"/>
+        </w:numPr>
+        <w:spacing w:after="0"/>
+        <w:rPr>
+          <w:rFonts w:ascii="Segoe UI Emoji" w:hAnsi="Segoe UI Emoji"/>
+          <w:sz w:val="16"/>
+          <w:szCs w:val="16"/>
+        </w:rPr>
+      </w:pPr>
+      <w:r>
+        <w:rPr>
+          <w:rFonts w:ascii="Segoe UI Emoji" w:hAnsi="Segoe UI Emoji"/>
+          <w:sz w:val="16"/>
+          <w:szCs w:val="16"/>
+        </w:rPr>
+        <w:t>Intentos externos de CSRF → devuelven 403 Forbidden.</w:t>
+      </w:r>
+    </w:p>
+    <w:p>
+      <w:pPr>
+        <w:numPr>
+          <w:ilvl w:val="0"/>
+          <w:numId w:val="27"/>
+        </w:numPr>
+        <w:spacing w:after="0"/>
+        <w:rPr>
+          <w:rFonts w:ascii="Segoe UI Emoji" w:hAnsi="Segoe UI Emoji"/>
+          <w:sz w:val="16"/>
+          <w:szCs w:val="16"/>
+        </w:rPr>
+      </w:pPr>
+      <w:r>
+        <w:rPr>
+          <w:rFonts w:ascii="Segoe UI Emoji" w:hAnsi="Segoe UI Emoji"/>
+          <w:sz w:val="16"/>
+          <w:szCs w:val="16"/>
+        </w:rPr>
+        <w:t>Tokens son únicos y difíciles de predecir gracias a SHA-256.</w:t>
+      </w:r>
+    </w:p>
+    <w:p>
+      <w:pPr>
+        <w:spacing w:after="0"/>
+        <w:rPr>
+          <w:rFonts w:ascii="Segoe UI Emoji" w:hAnsi="Segoe UI Emoji"/>
+          <w:sz w:val="16"/>
+          <w:szCs w:val="16"/>
+        </w:rPr>
+      </w:pPr>
+      <w:r>
+        <w:rPr>
+          <w:rFonts w:ascii="Segoe UI Emoji" w:hAnsi="Segoe UI Emoji"/>
+          <w:b/>
+          <w:bCs/>
+          <w:sz w:val="16"/>
+          <w:szCs w:val="16"/>
+        </w:rPr>
+        <w:t>Reflexión</w:t>
+      </w:r>
+    </w:p>
+    <w:p>
+      <w:pPr>
+        <w:numPr>
+          <w:ilvl w:val="0"/>
+          <w:numId w:val="28"/>
+        </w:numPr>
+        <w:spacing w:after="0"/>
+        <w:rPr>
+          <w:rFonts w:ascii="Segoe UI Emoji" w:hAnsi="Segoe UI Emoji"/>
+          <w:sz w:val="16"/>
+          <w:szCs w:val="16"/>
+        </w:rPr>
+      </w:pPr>
+      <w:r>
+        <w:rPr>
+          <w:rFonts w:ascii="Segoe UI Emoji" w:hAnsi="Segoe UI Emoji"/>
+          <w:sz w:val="16"/>
+          <w:szCs w:val="16"/>
+        </w:rPr>
+        <w:t>Aprendí que reforzar los tokens CSRF con hashing los hace más resistentes a ataques de falsificación.</w:t>
+      </w:r>
+    </w:p>
+    <w:p>
+      <w:pPr>
+        <w:numPr>
+          <w:ilvl w:val="0"/>
+          <w:numId w:val="28"/>
+        </w:numPr>
+        <w:spacing w:after="0"/>
+        <w:rPr>
+          <w:rFonts w:ascii="Segoe UI Emoji" w:hAnsi="Segoe UI Emoji"/>
+          <w:sz w:val="16"/>
+          <w:szCs w:val="16"/>
+        </w:rPr>
+      </w:pPr>
+      <w:r>
+        <w:rPr>
+          <w:rFonts w:ascii="Segoe UI Emoji" w:hAnsi="Segoe UI Emoji"/>
+          <w:sz w:val="16"/>
+          <w:szCs w:val="16"/>
+        </w:rPr>
+        <w:t>Documentar este cambio muestra cómo la teoría (hashing) se aplica directamente en la práctica de seguridad web.</w:t>
+      </w:r>
+    </w:p>
+    <w:p>
+      <w:pPr>
+        <w:numPr>
+          <w:ilvl w:val="0"/>
+          <w:numId w:val="28"/>
+        </w:numPr>
+        <w:spacing w:after="0"/>
+        <w:rPr>
+          <w:rFonts w:ascii="Segoe UI Emoji" w:hAnsi="Segoe UI Emoji"/>
+          <w:sz w:val="16"/>
+          <w:szCs w:val="16"/>
+        </w:rPr>
+      </w:pPr>
+      <w:r>
+        <w:rPr>
+          <w:rFonts w:ascii="Segoe UI Emoji" w:hAnsi="Segoe UI Emoji"/>
+          <w:sz w:val="16"/>
+          <w:szCs w:val="16"/>
+        </w:rPr>
+        <w:t>Mi laboratorio ahora refleja un entorno más cercano a producción, con login seguro y protección avanzada contra CSRF.</w:t>
+      </w:r>
     </w:p>
     <w:p>
       <w:pPr>
@@ -3089,6 +4089,155 @@
     </w:lvl>
   </w:abstractNum>
   <w:abstractNum w:abstractNumId="1" w15:restartNumberingAfterBreak="0">
+    <w:nsid w:val="0A132CB1"/>
+    <w:multiLevelType w:val="multilevel"/>
+    <w:tmpl w:val="6B3A097E"/>
+    <w:lvl w:ilvl="0">
+      <w:start w:val="1"/>
+      <w:numFmt w:val="bullet"/>
+      <w:lvlText w:val=""/>
+      <w:lvlJc w:val="left"/>
+      <w:pPr>
+        <w:tabs>
+          <w:tab w:val="num" w:pos="720"/>
+        </w:tabs>
+        <w:ind w:left="720" w:hanging="360"/>
+      </w:pPr>
+      <w:rPr>
+        <w:rFonts w:ascii="Symbol" w:hAnsi="Symbol" w:hint="default"/>
+        <w:sz w:val="20"/>
+      </w:rPr>
+    </w:lvl>
+    <w:lvl w:ilvl="1" w:tentative="1">
+      <w:start w:val="1"/>
+      <w:numFmt w:val="bullet"/>
+      <w:lvlText w:val="o"/>
+      <w:lvlJc w:val="left"/>
+      <w:pPr>
+        <w:tabs>
+          <w:tab w:val="num" w:pos="1440"/>
+        </w:tabs>
+        <w:ind w:left="1440" w:hanging="360"/>
+      </w:pPr>
+      <w:rPr>
+        <w:rFonts w:ascii="Courier New" w:hAnsi="Courier New" w:hint="default"/>
+        <w:sz w:val="20"/>
+      </w:rPr>
+    </w:lvl>
+    <w:lvl w:ilvl="2" w:tentative="1">
+      <w:start w:val="1"/>
+      <w:numFmt w:val="bullet"/>
+      <w:lvlText w:val=""/>
+      <w:lvlJc w:val="left"/>
+      <w:pPr>
+        <w:tabs>
+          <w:tab w:val="num" w:pos="2160"/>
+        </w:tabs>
+        <w:ind w:left="2160" w:hanging="360"/>
+      </w:pPr>
+      <w:rPr>
+        <w:rFonts w:ascii="Wingdings" w:hAnsi="Wingdings" w:hint="default"/>
+        <w:sz w:val="20"/>
+      </w:rPr>
+    </w:lvl>
+    <w:lvl w:ilvl="3" w:tentative="1">
+      <w:start w:val="1"/>
+      <w:numFmt w:val="bullet"/>
+      <w:lvlText w:val=""/>
+      <w:lvlJc w:val="left"/>
+      <w:pPr>
+        <w:tabs>
+          <w:tab w:val="num" w:pos="2880"/>
+        </w:tabs>
+        <w:ind w:left="2880" w:hanging="360"/>
+      </w:pPr>
+      <w:rPr>
+        <w:rFonts w:ascii="Wingdings" w:hAnsi="Wingdings" w:hint="default"/>
+        <w:sz w:val="20"/>
+      </w:rPr>
+    </w:lvl>
+    <w:lvl w:ilvl="4" w:tentative="1">
+      <w:start w:val="1"/>
+      <w:numFmt w:val="bullet"/>
+      <w:lvlText w:val=""/>
+      <w:lvlJc w:val="left"/>
+      <w:pPr>
+        <w:tabs>
+          <w:tab w:val="num" w:pos="3600"/>
+        </w:tabs>
+        <w:ind w:left="3600" w:hanging="360"/>
+      </w:pPr>
+      <w:rPr>
+        <w:rFonts w:ascii="Wingdings" w:hAnsi="Wingdings" w:hint="default"/>
+        <w:sz w:val="20"/>
+      </w:rPr>
+    </w:lvl>
+    <w:lvl w:ilvl="5" w:tentative="1">
+      <w:start w:val="1"/>
+      <w:numFmt w:val="bullet"/>
+      <w:lvlText w:val=""/>
+      <w:lvlJc w:val="left"/>
+      <w:pPr>
+        <w:tabs>
+          <w:tab w:val="num" w:pos="4320"/>
+        </w:tabs>
+        <w:ind w:left="4320" w:hanging="360"/>
+      </w:pPr>
+      <w:rPr>
+        <w:rFonts w:ascii="Wingdings" w:hAnsi="Wingdings" w:hint="default"/>
+        <w:sz w:val="20"/>
+      </w:rPr>
+    </w:lvl>
+    <w:lvl w:ilvl="6" w:tentative="1">
+      <w:start w:val="1"/>
+      <w:numFmt w:val="bullet"/>
+      <w:lvlText w:val=""/>
+      <w:lvlJc w:val="left"/>
+      <w:pPr>
+        <w:tabs>
+          <w:tab w:val="num" w:pos="5040"/>
+        </w:tabs>
+        <w:ind w:left="5040" w:hanging="360"/>
+      </w:pPr>
+      <w:rPr>
+        <w:rFonts w:ascii="Wingdings" w:hAnsi="Wingdings" w:hint="default"/>
+        <w:sz w:val="20"/>
+      </w:rPr>
+    </w:lvl>
+    <w:lvl w:ilvl="7" w:tentative="1">
+      <w:start w:val="1"/>
+      <w:numFmt w:val="bullet"/>
+      <w:lvlText w:val=""/>
+      <w:lvlJc w:val="left"/>
+      <w:pPr>
+        <w:tabs>
+          <w:tab w:val="num" w:pos="5760"/>
+        </w:tabs>
+        <w:ind w:left="5760" w:hanging="360"/>
+      </w:pPr>
+      <w:rPr>
+        <w:rFonts w:ascii="Wingdings" w:hAnsi="Wingdings" w:hint="default"/>
+        <w:sz w:val="20"/>
+      </w:rPr>
+    </w:lvl>
+    <w:lvl w:ilvl="8" w:tentative="1">
+      <w:start w:val="1"/>
+      <w:numFmt w:val="bullet"/>
+      <w:lvlText w:val=""/>
+      <w:lvlJc w:val="left"/>
+      <w:pPr>
+        <w:tabs>
+          <w:tab w:val="num" w:pos="6480"/>
+        </w:tabs>
+        <w:ind w:left="6480" w:hanging="360"/>
+      </w:pPr>
+      <w:rPr>
+        <w:rFonts w:ascii="Wingdings" w:hAnsi="Wingdings" w:hint="default"/>
+        <w:sz w:val="20"/>
+      </w:rPr>
+    </w:lvl>
+  </w:abstractNum>
+  <w:abstractNum w:abstractNumId="2" w15:restartNumberingAfterBreak="0">
     <w:nsid w:val="0F281E3F"/>
     <w:multiLevelType w:val="multilevel"/>
     <w:tmpl w:val="F852FDB0"/>
@@ -3205,7 +4354,7 @@
       </w:pPr>
     </w:lvl>
   </w:abstractNum>
-  <w:abstractNum w:abstractNumId="2" w15:restartNumberingAfterBreak="0">
+  <w:abstractNum w:abstractNumId="3" w15:restartNumberingAfterBreak="0">
     <w:nsid w:val="210A2603"/>
     <w:multiLevelType w:val="multilevel"/>
     <w:tmpl w:val="F6DE68E6"/>
@@ -3354,7 +4503,7 @@
       </w:rPr>
     </w:lvl>
   </w:abstractNum>
-  <w:abstractNum w:abstractNumId="3" w15:restartNumberingAfterBreak="0">
+  <w:abstractNum w:abstractNumId="4" w15:restartNumberingAfterBreak="0">
     <w:nsid w:val="32716808"/>
     <w:multiLevelType w:val="multilevel"/>
     <w:tmpl w:val="7550EA3E"/>
@@ -3503,7 +4652,7 @@
       </w:rPr>
     </w:lvl>
   </w:abstractNum>
-  <w:abstractNum w:abstractNumId="4" w15:restartNumberingAfterBreak="0">
+  <w:abstractNum w:abstractNumId="5" w15:restartNumberingAfterBreak="0">
     <w:nsid w:val="33A27D31"/>
     <w:multiLevelType w:val="multilevel"/>
     <w:tmpl w:val="34E22FFC"/>
@@ -3652,7 +4801,156 @@
       </w:rPr>
     </w:lvl>
   </w:abstractNum>
-  <w:abstractNum w:abstractNumId="5" w15:restartNumberingAfterBreak="0">
+  <w:abstractNum w:abstractNumId="6" w15:restartNumberingAfterBreak="0">
+    <w:nsid w:val="370A2AC3"/>
+    <w:multiLevelType w:val="multilevel"/>
+    <w:tmpl w:val="65F24E34"/>
+    <w:lvl w:ilvl="0">
+      <w:start w:val="1"/>
+      <w:numFmt w:val="bullet"/>
+      <w:lvlText w:val=""/>
+      <w:lvlJc w:val="left"/>
+      <w:pPr>
+        <w:tabs>
+          <w:tab w:val="num" w:pos="720"/>
+        </w:tabs>
+        <w:ind w:left="720" w:hanging="360"/>
+      </w:pPr>
+      <w:rPr>
+        <w:rFonts w:ascii="Symbol" w:hAnsi="Symbol" w:hint="default"/>
+        <w:sz w:val="20"/>
+      </w:rPr>
+    </w:lvl>
+    <w:lvl w:ilvl="1" w:tentative="1">
+      <w:start w:val="1"/>
+      <w:numFmt w:val="bullet"/>
+      <w:lvlText w:val="o"/>
+      <w:lvlJc w:val="left"/>
+      <w:pPr>
+        <w:tabs>
+          <w:tab w:val="num" w:pos="1440"/>
+        </w:tabs>
+        <w:ind w:left="1440" w:hanging="360"/>
+      </w:pPr>
+      <w:rPr>
+        <w:rFonts w:ascii="Courier New" w:hAnsi="Courier New" w:hint="default"/>
+        <w:sz w:val="20"/>
+      </w:rPr>
+    </w:lvl>
+    <w:lvl w:ilvl="2" w:tentative="1">
+      <w:start w:val="1"/>
+      <w:numFmt w:val="bullet"/>
+      <w:lvlText w:val=""/>
+      <w:lvlJc w:val="left"/>
+      <w:pPr>
+        <w:tabs>
+          <w:tab w:val="num" w:pos="2160"/>
+        </w:tabs>
+        <w:ind w:left="2160" w:hanging="360"/>
+      </w:pPr>
+      <w:rPr>
+        <w:rFonts w:ascii="Wingdings" w:hAnsi="Wingdings" w:hint="default"/>
+        <w:sz w:val="20"/>
+      </w:rPr>
+    </w:lvl>
+    <w:lvl w:ilvl="3" w:tentative="1">
+      <w:start w:val="1"/>
+      <w:numFmt w:val="bullet"/>
+      <w:lvlText w:val=""/>
+      <w:lvlJc w:val="left"/>
+      <w:pPr>
+        <w:tabs>
+          <w:tab w:val="num" w:pos="2880"/>
+        </w:tabs>
+        <w:ind w:left="2880" w:hanging="360"/>
+      </w:pPr>
+      <w:rPr>
+        <w:rFonts w:ascii="Wingdings" w:hAnsi="Wingdings" w:hint="default"/>
+        <w:sz w:val="20"/>
+      </w:rPr>
+    </w:lvl>
+    <w:lvl w:ilvl="4" w:tentative="1">
+      <w:start w:val="1"/>
+      <w:numFmt w:val="bullet"/>
+      <w:lvlText w:val=""/>
+      <w:lvlJc w:val="left"/>
+      <w:pPr>
+        <w:tabs>
+          <w:tab w:val="num" w:pos="3600"/>
+        </w:tabs>
+        <w:ind w:left="3600" w:hanging="360"/>
+      </w:pPr>
+      <w:rPr>
+        <w:rFonts w:ascii="Wingdings" w:hAnsi="Wingdings" w:hint="default"/>
+        <w:sz w:val="20"/>
+      </w:rPr>
+    </w:lvl>
+    <w:lvl w:ilvl="5" w:tentative="1">
+      <w:start w:val="1"/>
+      <w:numFmt w:val="bullet"/>
+      <w:lvlText w:val=""/>
+      <w:lvlJc w:val="left"/>
+      <w:pPr>
+        <w:tabs>
+          <w:tab w:val="num" w:pos="4320"/>
+        </w:tabs>
+        <w:ind w:left="4320" w:hanging="360"/>
+      </w:pPr>
+      <w:rPr>
+        <w:rFonts w:ascii="Wingdings" w:hAnsi="Wingdings" w:hint="default"/>
+        <w:sz w:val="20"/>
+      </w:rPr>
+    </w:lvl>
+    <w:lvl w:ilvl="6" w:tentative="1">
+      <w:start w:val="1"/>
+      <w:numFmt w:val="bullet"/>
+      <w:lvlText w:val=""/>
+      <w:lvlJc w:val="left"/>
+      <w:pPr>
+        <w:tabs>
+          <w:tab w:val="num" w:pos="5040"/>
+        </w:tabs>
+        <w:ind w:left="5040" w:hanging="360"/>
+      </w:pPr>
+      <w:rPr>
+        <w:rFonts w:ascii="Wingdings" w:hAnsi="Wingdings" w:hint="default"/>
+        <w:sz w:val="20"/>
+      </w:rPr>
+    </w:lvl>
+    <w:lvl w:ilvl="7" w:tentative="1">
+      <w:start w:val="1"/>
+      <w:numFmt w:val="bullet"/>
+      <w:lvlText w:val=""/>
+      <w:lvlJc w:val="left"/>
+      <w:pPr>
+        <w:tabs>
+          <w:tab w:val="num" w:pos="5760"/>
+        </w:tabs>
+        <w:ind w:left="5760" w:hanging="360"/>
+      </w:pPr>
+      <w:rPr>
+        <w:rFonts w:ascii="Wingdings" w:hAnsi="Wingdings" w:hint="default"/>
+        <w:sz w:val="20"/>
+      </w:rPr>
+    </w:lvl>
+    <w:lvl w:ilvl="8" w:tentative="1">
+      <w:start w:val="1"/>
+      <w:numFmt w:val="bullet"/>
+      <w:lvlText w:val=""/>
+      <w:lvlJc w:val="left"/>
+      <w:pPr>
+        <w:tabs>
+          <w:tab w:val="num" w:pos="6480"/>
+        </w:tabs>
+        <w:ind w:left="6480" w:hanging="360"/>
+      </w:pPr>
+      <w:rPr>
+        <w:rFonts w:ascii="Wingdings" w:hAnsi="Wingdings" w:hint="default"/>
+        <w:sz w:val="20"/>
+      </w:rPr>
+    </w:lvl>
+  </w:abstractNum>
+  <w:abstractNum w:abstractNumId="7" w15:restartNumberingAfterBreak="0">
     <w:nsid w:val="38E02D23"/>
     <w:multiLevelType w:val="multilevel"/>
     <w:tmpl w:val="C96E109E"/>
@@ -3769,7 +5067,7 @@
       </w:pPr>
     </w:lvl>
   </w:abstractNum>
-  <w:abstractNum w:abstractNumId="6" w15:restartNumberingAfterBreak="0">
+  <w:abstractNum w:abstractNumId="8" w15:restartNumberingAfterBreak="0">
     <w:nsid w:val="39745009"/>
     <w:multiLevelType w:val="multilevel"/>
     <w:tmpl w:val="59244278"/>
@@ -3918,7 +5216,156 @@
       </w:rPr>
     </w:lvl>
   </w:abstractNum>
-  <w:abstractNum w:abstractNumId="7" w15:restartNumberingAfterBreak="0">
+  <w:abstractNum w:abstractNumId="9" w15:restartNumberingAfterBreak="0">
+    <w:nsid w:val="41C43940"/>
+    <w:multiLevelType w:val="multilevel"/>
+    <w:tmpl w:val="006EB456"/>
+    <w:lvl w:ilvl="0">
+      <w:start w:val="1"/>
+      <w:numFmt w:val="bullet"/>
+      <w:lvlText w:val=""/>
+      <w:lvlJc w:val="left"/>
+      <w:pPr>
+        <w:tabs>
+          <w:tab w:val="num" w:pos="720"/>
+        </w:tabs>
+        <w:ind w:left="720" w:hanging="360"/>
+      </w:pPr>
+      <w:rPr>
+        <w:rFonts w:ascii="Symbol" w:hAnsi="Symbol" w:hint="default"/>
+        <w:sz w:val="20"/>
+      </w:rPr>
+    </w:lvl>
+    <w:lvl w:ilvl="1" w:tentative="1">
+      <w:start w:val="1"/>
+      <w:numFmt w:val="bullet"/>
+      <w:lvlText w:val="o"/>
+      <w:lvlJc w:val="left"/>
+      <w:pPr>
+        <w:tabs>
+          <w:tab w:val="num" w:pos="1440"/>
+        </w:tabs>
+        <w:ind w:left="1440" w:hanging="360"/>
+      </w:pPr>
+      <w:rPr>
+        <w:rFonts w:ascii="Courier New" w:hAnsi="Courier New" w:hint="default"/>
+        <w:sz w:val="20"/>
+      </w:rPr>
+    </w:lvl>
+    <w:lvl w:ilvl="2" w:tentative="1">
+      <w:start w:val="1"/>
+      <w:numFmt w:val="bullet"/>
+      <w:lvlText w:val=""/>
+      <w:lvlJc w:val="left"/>
+      <w:pPr>
+        <w:tabs>
+          <w:tab w:val="num" w:pos="2160"/>
+        </w:tabs>
+        <w:ind w:left="2160" w:hanging="360"/>
+      </w:pPr>
+      <w:rPr>
+        <w:rFonts w:ascii="Wingdings" w:hAnsi="Wingdings" w:hint="default"/>
+        <w:sz w:val="20"/>
+      </w:rPr>
+    </w:lvl>
+    <w:lvl w:ilvl="3" w:tentative="1">
+      <w:start w:val="1"/>
+      <w:numFmt w:val="bullet"/>
+      <w:lvlText w:val=""/>
+      <w:lvlJc w:val="left"/>
+      <w:pPr>
+        <w:tabs>
+          <w:tab w:val="num" w:pos="2880"/>
+        </w:tabs>
+        <w:ind w:left="2880" w:hanging="360"/>
+      </w:pPr>
+      <w:rPr>
+        <w:rFonts w:ascii="Wingdings" w:hAnsi="Wingdings" w:hint="default"/>
+        <w:sz w:val="20"/>
+      </w:rPr>
+    </w:lvl>
+    <w:lvl w:ilvl="4" w:tentative="1">
+      <w:start w:val="1"/>
+      <w:numFmt w:val="bullet"/>
+      <w:lvlText w:val=""/>
+      <w:lvlJc w:val="left"/>
+      <w:pPr>
+        <w:tabs>
+          <w:tab w:val="num" w:pos="3600"/>
+        </w:tabs>
+        <w:ind w:left="3600" w:hanging="360"/>
+      </w:pPr>
+      <w:rPr>
+        <w:rFonts w:ascii="Wingdings" w:hAnsi="Wingdings" w:hint="default"/>
+        <w:sz w:val="20"/>
+      </w:rPr>
+    </w:lvl>
+    <w:lvl w:ilvl="5" w:tentative="1">
+      <w:start w:val="1"/>
+      <w:numFmt w:val="bullet"/>
+      <w:lvlText w:val=""/>
+      <w:lvlJc w:val="left"/>
+      <w:pPr>
+        <w:tabs>
+          <w:tab w:val="num" w:pos="4320"/>
+        </w:tabs>
+        <w:ind w:left="4320" w:hanging="360"/>
+      </w:pPr>
+      <w:rPr>
+        <w:rFonts w:ascii="Wingdings" w:hAnsi="Wingdings" w:hint="default"/>
+        <w:sz w:val="20"/>
+      </w:rPr>
+    </w:lvl>
+    <w:lvl w:ilvl="6" w:tentative="1">
+      <w:start w:val="1"/>
+      <w:numFmt w:val="bullet"/>
+      <w:lvlText w:val=""/>
+      <w:lvlJc w:val="left"/>
+      <w:pPr>
+        <w:tabs>
+          <w:tab w:val="num" w:pos="5040"/>
+        </w:tabs>
+        <w:ind w:left="5040" w:hanging="360"/>
+      </w:pPr>
+      <w:rPr>
+        <w:rFonts w:ascii="Wingdings" w:hAnsi="Wingdings" w:hint="default"/>
+        <w:sz w:val="20"/>
+      </w:rPr>
+    </w:lvl>
+    <w:lvl w:ilvl="7" w:tentative="1">
+      <w:start w:val="1"/>
+      <w:numFmt w:val="bullet"/>
+      <w:lvlText w:val=""/>
+      <w:lvlJc w:val="left"/>
+      <w:pPr>
+        <w:tabs>
+          <w:tab w:val="num" w:pos="5760"/>
+        </w:tabs>
+        <w:ind w:left="5760" w:hanging="360"/>
+      </w:pPr>
+      <w:rPr>
+        <w:rFonts w:ascii="Wingdings" w:hAnsi="Wingdings" w:hint="default"/>
+        <w:sz w:val="20"/>
+      </w:rPr>
+    </w:lvl>
+    <w:lvl w:ilvl="8" w:tentative="1">
+      <w:start w:val="1"/>
+      <w:numFmt w:val="bullet"/>
+      <w:lvlText w:val=""/>
+      <w:lvlJc w:val="left"/>
+      <w:pPr>
+        <w:tabs>
+          <w:tab w:val="num" w:pos="6480"/>
+        </w:tabs>
+        <w:ind w:left="6480" w:hanging="360"/>
+      </w:pPr>
+      <w:rPr>
+        <w:rFonts w:ascii="Wingdings" w:hAnsi="Wingdings" w:hint="default"/>
+        <w:sz w:val="20"/>
+      </w:rPr>
+    </w:lvl>
+  </w:abstractNum>
+  <w:abstractNum w:abstractNumId="10" w15:restartNumberingAfterBreak="0">
     <w:nsid w:val="41D55342"/>
     <w:multiLevelType w:val="multilevel"/>
     <w:tmpl w:val="954861FC"/>
@@ -4067,7 +5514,7 @@
       </w:rPr>
     </w:lvl>
   </w:abstractNum>
-  <w:abstractNum w:abstractNumId="8" w15:restartNumberingAfterBreak="0">
+  <w:abstractNum w:abstractNumId="11" w15:restartNumberingAfterBreak="0">
     <w:nsid w:val="4311232D"/>
     <w:multiLevelType w:val="multilevel"/>
     <w:tmpl w:val="71AE97CC"/>
@@ -4216,7 +5663,7 @@
       </w:rPr>
     </w:lvl>
   </w:abstractNum>
-  <w:abstractNum w:abstractNumId="9" w15:restartNumberingAfterBreak="0">
+  <w:abstractNum w:abstractNumId="12" w15:restartNumberingAfterBreak="0">
     <w:nsid w:val="45D53F16"/>
     <w:multiLevelType w:val="multilevel"/>
     <w:tmpl w:val="D96C9A1E"/>
@@ -4365,7 +5812,7 @@
       </w:rPr>
     </w:lvl>
   </w:abstractNum>
-  <w:abstractNum w:abstractNumId="10" w15:restartNumberingAfterBreak="0">
+  <w:abstractNum w:abstractNumId="13" w15:restartNumberingAfterBreak="0">
     <w:nsid w:val="46AF69C2"/>
     <w:multiLevelType w:val="multilevel"/>
     <w:tmpl w:val="F9C81B7E"/>
@@ -4514,7 +5961,7 @@
       </w:rPr>
     </w:lvl>
   </w:abstractNum>
-  <w:abstractNum w:abstractNumId="11" w15:restartNumberingAfterBreak="0">
+  <w:abstractNum w:abstractNumId="14" w15:restartNumberingAfterBreak="0">
     <w:nsid w:val="4BA3789B"/>
     <w:multiLevelType w:val="multilevel"/>
     <w:tmpl w:val="689CAB6A"/>
@@ -4663,7 +6110,156 @@
       </w:rPr>
     </w:lvl>
   </w:abstractNum>
-  <w:abstractNum w:abstractNumId="12" w15:restartNumberingAfterBreak="0">
+  <w:abstractNum w:abstractNumId="15" w15:restartNumberingAfterBreak="0">
+    <w:nsid w:val="50B74B67"/>
+    <w:multiLevelType w:val="multilevel"/>
+    <w:tmpl w:val="F5BA9EBC"/>
+    <w:lvl w:ilvl="0">
+      <w:start w:val="1"/>
+      <w:numFmt w:val="bullet"/>
+      <w:lvlText w:val=""/>
+      <w:lvlJc w:val="left"/>
+      <w:pPr>
+        <w:tabs>
+          <w:tab w:val="num" w:pos="720"/>
+        </w:tabs>
+        <w:ind w:left="720" w:hanging="360"/>
+      </w:pPr>
+      <w:rPr>
+        <w:rFonts w:ascii="Symbol" w:hAnsi="Symbol" w:hint="default"/>
+        <w:sz w:val="20"/>
+      </w:rPr>
+    </w:lvl>
+    <w:lvl w:ilvl="1" w:tentative="1">
+      <w:start w:val="1"/>
+      <w:numFmt w:val="bullet"/>
+      <w:lvlText w:val="o"/>
+      <w:lvlJc w:val="left"/>
+      <w:pPr>
+        <w:tabs>
+          <w:tab w:val="num" w:pos="1440"/>
+        </w:tabs>
+        <w:ind w:left="1440" w:hanging="360"/>
+      </w:pPr>
+      <w:rPr>
+        <w:rFonts w:ascii="Courier New" w:hAnsi="Courier New" w:hint="default"/>
+        <w:sz w:val="20"/>
+      </w:rPr>
+    </w:lvl>
+    <w:lvl w:ilvl="2" w:tentative="1">
+      <w:start w:val="1"/>
+      <w:numFmt w:val="bullet"/>
+      <w:lvlText w:val=""/>
+      <w:lvlJc w:val="left"/>
+      <w:pPr>
+        <w:tabs>
+          <w:tab w:val="num" w:pos="2160"/>
+        </w:tabs>
+        <w:ind w:left="2160" w:hanging="360"/>
+      </w:pPr>
+      <w:rPr>
+        <w:rFonts w:ascii="Wingdings" w:hAnsi="Wingdings" w:hint="default"/>
+        <w:sz w:val="20"/>
+      </w:rPr>
+    </w:lvl>
+    <w:lvl w:ilvl="3" w:tentative="1">
+      <w:start w:val="1"/>
+      <w:numFmt w:val="bullet"/>
+      <w:lvlText w:val=""/>
+      <w:lvlJc w:val="left"/>
+      <w:pPr>
+        <w:tabs>
+          <w:tab w:val="num" w:pos="2880"/>
+        </w:tabs>
+        <w:ind w:left="2880" w:hanging="360"/>
+      </w:pPr>
+      <w:rPr>
+        <w:rFonts w:ascii="Wingdings" w:hAnsi="Wingdings" w:hint="default"/>
+        <w:sz w:val="20"/>
+      </w:rPr>
+    </w:lvl>
+    <w:lvl w:ilvl="4" w:tentative="1">
+      <w:start w:val="1"/>
+      <w:numFmt w:val="bullet"/>
+      <w:lvlText w:val=""/>
+      <w:lvlJc w:val="left"/>
+      <w:pPr>
+        <w:tabs>
+          <w:tab w:val="num" w:pos="3600"/>
+        </w:tabs>
+        <w:ind w:left="3600" w:hanging="360"/>
+      </w:pPr>
+      <w:rPr>
+        <w:rFonts w:ascii="Wingdings" w:hAnsi="Wingdings" w:hint="default"/>
+        <w:sz w:val="20"/>
+      </w:rPr>
+    </w:lvl>
+    <w:lvl w:ilvl="5" w:tentative="1">
+      <w:start w:val="1"/>
+      <w:numFmt w:val="bullet"/>
+      <w:lvlText w:val=""/>
+      <w:lvlJc w:val="left"/>
+      <w:pPr>
+        <w:tabs>
+          <w:tab w:val="num" w:pos="4320"/>
+        </w:tabs>
+        <w:ind w:left="4320" w:hanging="360"/>
+      </w:pPr>
+      <w:rPr>
+        <w:rFonts w:ascii="Wingdings" w:hAnsi="Wingdings" w:hint="default"/>
+        <w:sz w:val="20"/>
+      </w:rPr>
+    </w:lvl>
+    <w:lvl w:ilvl="6" w:tentative="1">
+      <w:start w:val="1"/>
+      <w:numFmt w:val="bullet"/>
+      <w:lvlText w:val=""/>
+      <w:lvlJc w:val="left"/>
+      <w:pPr>
+        <w:tabs>
+          <w:tab w:val="num" w:pos="5040"/>
+        </w:tabs>
+        <w:ind w:left="5040" w:hanging="360"/>
+      </w:pPr>
+      <w:rPr>
+        <w:rFonts w:ascii="Wingdings" w:hAnsi="Wingdings" w:hint="default"/>
+        <w:sz w:val="20"/>
+      </w:rPr>
+    </w:lvl>
+    <w:lvl w:ilvl="7" w:tentative="1">
+      <w:start w:val="1"/>
+      <w:numFmt w:val="bullet"/>
+      <w:lvlText w:val=""/>
+      <w:lvlJc w:val="left"/>
+      <w:pPr>
+        <w:tabs>
+          <w:tab w:val="num" w:pos="5760"/>
+        </w:tabs>
+        <w:ind w:left="5760" w:hanging="360"/>
+      </w:pPr>
+      <w:rPr>
+        <w:rFonts w:ascii="Wingdings" w:hAnsi="Wingdings" w:hint="default"/>
+        <w:sz w:val="20"/>
+      </w:rPr>
+    </w:lvl>
+    <w:lvl w:ilvl="8" w:tentative="1">
+      <w:start w:val="1"/>
+      <w:numFmt w:val="bullet"/>
+      <w:lvlText w:val=""/>
+      <w:lvlJc w:val="left"/>
+      <w:pPr>
+        <w:tabs>
+          <w:tab w:val="num" w:pos="6480"/>
+        </w:tabs>
+        <w:ind w:left="6480" w:hanging="360"/>
+      </w:pPr>
+      <w:rPr>
+        <w:rFonts w:ascii="Wingdings" w:hAnsi="Wingdings" w:hint="default"/>
+        <w:sz w:val="20"/>
+      </w:rPr>
+    </w:lvl>
+  </w:abstractNum>
+  <w:abstractNum w:abstractNumId="16" w15:restartNumberingAfterBreak="0">
     <w:nsid w:val="58601B61"/>
     <w:multiLevelType w:val="multilevel"/>
     <w:tmpl w:val="1F008C50"/>
@@ -4780,7 +6376,7 @@
       </w:pPr>
     </w:lvl>
   </w:abstractNum>
-  <w:abstractNum w:abstractNumId="13" w15:restartNumberingAfterBreak="0">
+  <w:abstractNum w:abstractNumId="17" w15:restartNumberingAfterBreak="0">
     <w:nsid w:val="60903ACD"/>
     <w:multiLevelType w:val="multilevel"/>
     <w:tmpl w:val="0EECF7EE"/>
@@ -4929,7 +6525,156 @@
       </w:rPr>
     </w:lvl>
   </w:abstractNum>
-  <w:abstractNum w:abstractNumId="14" w15:restartNumberingAfterBreak="0">
+  <w:abstractNum w:abstractNumId="18" w15:restartNumberingAfterBreak="0">
+    <w:nsid w:val="62F10583"/>
+    <w:multiLevelType w:val="multilevel"/>
+    <w:tmpl w:val="3BB04728"/>
+    <w:lvl w:ilvl="0">
+      <w:start w:val="1"/>
+      <w:numFmt w:val="bullet"/>
+      <w:lvlText w:val=""/>
+      <w:lvlJc w:val="left"/>
+      <w:pPr>
+        <w:tabs>
+          <w:tab w:val="num" w:pos="720"/>
+        </w:tabs>
+        <w:ind w:left="720" w:hanging="360"/>
+      </w:pPr>
+      <w:rPr>
+        <w:rFonts w:ascii="Symbol" w:hAnsi="Symbol" w:hint="default"/>
+        <w:sz w:val="20"/>
+      </w:rPr>
+    </w:lvl>
+    <w:lvl w:ilvl="1" w:tentative="1">
+      <w:start w:val="1"/>
+      <w:numFmt w:val="bullet"/>
+      <w:lvlText w:val="o"/>
+      <w:lvlJc w:val="left"/>
+      <w:pPr>
+        <w:tabs>
+          <w:tab w:val="num" w:pos="1440"/>
+        </w:tabs>
+        <w:ind w:left="1440" w:hanging="360"/>
+      </w:pPr>
+      <w:rPr>
+        <w:rFonts w:ascii="Courier New" w:hAnsi="Courier New" w:hint="default"/>
+        <w:sz w:val="20"/>
+      </w:rPr>
+    </w:lvl>
+    <w:lvl w:ilvl="2" w:tentative="1">
+      <w:start w:val="1"/>
+      <w:numFmt w:val="bullet"/>
+      <w:lvlText w:val=""/>
+      <w:lvlJc w:val="left"/>
+      <w:pPr>
+        <w:tabs>
+          <w:tab w:val="num" w:pos="2160"/>
+        </w:tabs>
+        <w:ind w:left="2160" w:hanging="360"/>
+      </w:pPr>
+      <w:rPr>
+        <w:rFonts w:ascii="Wingdings" w:hAnsi="Wingdings" w:hint="default"/>
+        <w:sz w:val="20"/>
+      </w:rPr>
+    </w:lvl>
+    <w:lvl w:ilvl="3" w:tentative="1">
+      <w:start w:val="1"/>
+      <w:numFmt w:val="bullet"/>
+      <w:lvlText w:val=""/>
+      <w:lvlJc w:val="left"/>
+      <w:pPr>
+        <w:tabs>
+          <w:tab w:val="num" w:pos="2880"/>
+        </w:tabs>
+        <w:ind w:left="2880" w:hanging="360"/>
+      </w:pPr>
+      <w:rPr>
+        <w:rFonts w:ascii="Wingdings" w:hAnsi="Wingdings" w:hint="default"/>
+        <w:sz w:val="20"/>
+      </w:rPr>
+    </w:lvl>
+    <w:lvl w:ilvl="4" w:tentative="1">
+      <w:start w:val="1"/>
+      <w:numFmt w:val="bullet"/>
+      <w:lvlText w:val=""/>
+      <w:lvlJc w:val="left"/>
+      <w:pPr>
+        <w:tabs>
+          <w:tab w:val="num" w:pos="3600"/>
+        </w:tabs>
+        <w:ind w:left="3600" w:hanging="360"/>
+      </w:pPr>
+      <w:rPr>
+        <w:rFonts w:ascii="Wingdings" w:hAnsi="Wingdings" w:hint="default"/>
+        <w:sz w:val="20"/>
+      </w:rPr>
+    </w:lvl>
+    <w:lvl w:ilvl="5" w:tentative="1">
+      <w:start w:val="1"/>
+      <w:numFmt w:val="bullet"/>
+      <w:lvlText w:val=""/>
+      <w:lvlJc w:val="left"/>
+      <w:pPr>
+        <w:tabs>
+          <w:tab w:val="num" w:pos="4320"/>
+        </w:tabs>
+        <w:ind w:left="4320" w:hanging="360"/>
+      </w:pPr>
+      <w:rPr>
+        <w:rFonts w:ascii="Wingdings" w:hAnsi="Wingdings" w:hint="default"/>
+        <w:sz w:val="20"/>
+      </w:rPr>
+    </w:lvl>
+    <w:lvl w:ilvl="6" w:tentative="1">
+      <w:start w:val="1"/>
+      <w:numFmt w:val="bullet"/>
+      <w:lvlText w:val=""/>
+      <w:lvlJc w:val="left"/>
+      <w:pPr>
+        <w:tabs>
+          <w:tab w:val="num" w:pos="5040"/>
+        </w:tabs>
+        <w:ind w:left="5040" w:hanging="360"/>
+      </w:pPr>
+      <w:rPr>
+        <w:rFonts w:ascii="Wingdings" w:hAnsi="Wingdings" w:hint="default"/>
+        <w:sz w:val="20"/>
+      </w:rPr>
+    </w:lvl>
+    <w:lvl w:ilvl="7" w:tentative="1">
+      <w:start w:val="1"/>
+      <w:numFmt w:val="bullet"/>
+      <w:lvlText w:val=""/>
+      <w:lvlJc w:val="left"/>
+      <w:pPr>
+        <w:tabs>
+          <w:tab w:val="num" w:pos="5760"/>
+        </w:tabs>
+        <w:ind w:left="5760" w:hanging="360"/>
+      </w:pPr>
+      <w:rPr>
+        <w:rFonts w:ascii="Wingdings" w:hAnsi="Wingdings" w:hint="default"/>
+        <w:sz w:val="20"/>
+      </w:rPr>
+    </w:lvl>
+    <w:lvl w:ilvl="8" w:tentative="1">
+      <w:start w:val="1"/>
+      <w:numFmt w:val="bullet"/>
+      <w:lvlText w:val=""/>
+      <w:lvlJc w:val="left"/>
+      <w:pPr>
+        <w:tabs>
+          <w:tab w:val="num" w:pos="6480"/>
+        </w:tabs>
+        <w:ind w:left="6480" w:hanging="360"/>
+      </w:pPr>
+      <w:rPr>
+        <w:rFonts w:ascii="Wingdings" w:hAnsi="Wingdings" w:hint="default"/>
+        <w:sz w:val="20"/>
+      </w:rPr>
+    </w:lvl>
+  </w:abstractNum>
+  <w:abstractNum w:abstractNumId="19" w15:restartNumberingAfterBreak="0">
     <w:nsid w:val="64D626FE"/>
     <w:multiLevelType w:val="multilevel"/>
     <w:tmpl w:val="42065EB4"/>
@@ -5078,7 +6823,7 @@
       </w:rPr>
     </w:lvl>
   </w:abstractNum>
-  <w:abstractNum w:abstractNumId="15" w15:restartNumberingAfterBreak="0">
+  <w:abstractNum w:abstractNumId="20" w15:restartNumberingAfterBreak="0">
     <w:nsid w:val="665351DF"/>
     <w:multiLevelType w:val="multilevel"/>
     <w:tmpl w:val="1CC40404"/>
@@ -5227,7 +6972,7 @@
       </w:rPr>
     </w:lvl>
   </w:abstractNum>
-  <w:abstractNum w:abstractNumId="16" w15:restartNumberingAfterBreak="0">
+  <w:abstractNum w:abstractNumId="21" w15:restartNumberingAfterBreak="0">
     <w:nsid w:val="684C6DE2"/>
     <w:multiLevelType w:val="multilevel"/>
     <w:tmpl w:val="72882890"/>
@@ -5376,7 +7121,7 @@
       </w:rPr>
     </w:lvl>
   </w:abstractNum>
-  <w:abstractNum w:abstractNumId="17" w15:restartNumberingAfterBreak="0">
+  <w:abstractNum w:abstractNumId="22" w15:restartNumberingAfterBreak="0">
     <w:nsid w:val="69AF24C6"/>
     <w:multiLevelType w:val="multilevel"/>
     <w:tmpl w:val="FC168FD2"/>
@@ -5525,7 +7270,7 @@
       </w:rPr>
     </w:lvl>
   </w:abstractNum>
-  <w:abstractNum w:abstractNumId="18" w15:restartNumberingAfterBreak="0">
+  <w:abstractNum w:abstractNumId="23" w15:restartNumberingAfterBreak="0">
     <w:nsid w:val="6DB6277D"/>
     <w:multiLevelType w:val="multilevel"/>
     <w:tmpl w:val="63EA98E6"/>
@@ -5642,7 +7387,7 @@
       </w:pPr>
     </w:lvl>
   </w:abstractNum>
-  <w:abstractNum w:abstractNumId="19" w15:restartNumberingAfterBreak="0">
+  <w:abstractNum w:abstractNumId="24" w15:restartNumberingAfterBreak="0">
     <w:nsid w:val="6FCD520B"/>
     <w:multiLevelType w:val="multilevel"/>
     <w:tmpl w:val="649ADA20"/>
@@ -5791,7 +7536,7 @@
       </w:rPr>
     </w:lvl>
   </w:abstractNum>
-  <w:abstractNum w:abstractNumId="20" w15:restartNumberingAfterBreak="0">
+  <w:abstractNum w:abstractNumId="25" w15:restartNumberingAfterBreak="0">
     <w:nsid w:val="79C26A8E"/>
     <w:multiLevelType w:val="multilevel"/>
     <w:tmpl w:val="50BA50EA"/>
@@ -5908,7 +7653,156 @@
       </w:pPr>
     </w:lvl>
   </w:abstractNum>
-  <w:abstractNum w:abstractNumId="21" w15:restartNumberingAfterBreak="0">
+  <w:abstractNum w:abstractNumId="26" w15:restartNumberingAfterBreak="0">
+    <w:nsid w:val="7C9D747D"/>
+    <w:multiLevelType w:val="multilevel"/>
+    <w:tmpl w:val="4E2693A4"/>
+    <w:lvl w:ilvl="0">
+      <w:start w:val="1"/>
+      <w:numFmt w:val="bullet"/>
+      <w:lvlText w:val=""/>
+      <w:lvlJc w:val="left"/>
+      <w:pPr>
+        <w:tabs>
+          <w:tab w:val="num" w:pos="720"/>
+        </w:tabs>
+        <w:ind w:left="720" w:hanging="360"/>
+      </w:pPr>
+      <w:rPr>
+        <w:rFonts w:ascii="Symbol" w:hAnsi="Symbol" w:hint="default"/>
+        <w:sz w:val="20"/>
+      </w:rPr>
+    </w:lvl>
+    <w:lvl w:ilvl="1" w:tentative="1">
+      <w:start w:val="1"/>
+      <w:numFmt w:val="bullet"/>
+      <w:lvlText w:val="o"/>
+      <w:lvlJc w:val="left"/>
+      <w:pPr>
+        <w:tabs>
+          <w:tab w:val="num" w:pos="1440"/>
+        </w:tabs>
+        <w:ind w:left="1440" w:hanging="360"/>
+      </w:pPr>
+      <w:rPr>
+        <w:rFonts w:ascii="Courier New" w:hAnsi="Courier New" w:hint="default"/>
+        <w:sz w:val="20"/>
+      </w:rPr>
+    </w:lvl>
+    <w:lvl w:ilvl="2" w:tentative="1">
+      <w:start w:val="1"/>
+      <w:numFmt w:val="bullet"/>
+      <w:lvlText w:val=""/>
+      <w:lvlJc w:val="left"/>
+      <w:pPr>
+        <w:tabs>
+          <w:tab w:val="num" w:pos="2160"/>
+        </w:tabs>
+        <w:ind w:left="2160" w:hanging="360"/>
+      </w:pPr>
+      <w:rPr>
+        <w:rFonts w:ascii="Wingdings" w:hAnsi="Wingdings" w:hint="default"/>
+        <w:sz w:val="20"/>
+      </w:rPr>
+    </w:lvl>
+    <w:lvl w:ilvl="3" w:tentative="1">
+      <w:start w:val="1"/>
+      <w:numFmt w:val="bullet"/>
+      <w:lvlText w:val=""/>
+      <w:lvlJc w:val="left"/>
+      <w:pPr>
+        <w:tabs>
+          <w:tab w:val="num" w:pos="2880"/>
+        </w:tabs>
+        <w:ind w:left="2880" w:hanging="360"/>
+      </w:pPr>
+      <w:rPr>
+        <w:rFonts w:ascii="Wingdings" w:hAnsi="Wingdings" w:hint="default"/>
+        <w:sz w:val="20"/>
+      </w:rPr>
+    </w:lvl>
+    <w:lvl w:ilvl="4" w:tentative="1">
+      <w:start w:val="1"/>
+      <w:numFmt w:val="bullet"/>
+      <w:lvlText w:val=""/>
+      <w:lvlJc w:val="left"/>
+      <w:pPr>
+        <w:tabs>
+          <w:tab w:val="num" w:pos="3600"/>
+        </w:tabs>
+        <w:ind w:left="3600" w:hanging="360"/>
+      </w:pPr>
+      <w:rPr>
+        <w:rFonts w:ascii="Wingdings" w:hAnsi="Wingdings" w:hint="default"/>
+        <w:sz w:val="20"/>
+      </w:rPr>
+    </w:lvl>
+    <w:lvl w:ilvl="5" w:tentative="1">
+      <w:start w:val="1"/>
+      <w:numFmt w:val="bullet"/>
+      <w:lvlText w:val=""/>
+      <w:lvlJc w:val="left"/>
+      <w:pPr>
+        <w:tabs>
+          <w:tab w:val="num" w:pos="4320"/>
+        </w:tabs>
+        <w:ind w:left="4320" w:hanging="360"/>
+      </w:pPr>
+      <w:rPr>
+        <w:rFonts w:ascii="Wingdings" w:hAnsi="Wingdings" w:hint="default"/>
+        <w:sz w:val="20"/>
+      </w:rPr>
+    </w:lvl>
+    <w:lvl w:ilvl="6" w:tentative="1">
+      <w:start w:val="1"/>
+      <w:numFmt w:val="bullet"/>
+      <w:lvlText w:val=""/>
+      <w:lvlJc w:val="left"/>
+      <w:pPr>
+        <w:tabs>
+          <w:tab w:val="num" w:pos="5040"/>
+        </w:tabs>
+        <w:ind w:left="5040" w:hanging="360"/>
+      </w:pPr>
+      <w:rPr>
+        <w:rFonts w:ascii="Wingdings" w:hAnsi="Wingdings" w:hint="default"/>
+        <w:sz w:val="20"/>
+      </w:rPr>
+    </w:lvl>
+    <w:lvl w:ilvl="7" w:tentative="1">
+      <w:start w:val="1"/>
+      <w:numFmt w:val="bullet"/>
+      <w:lvlText w:val=""/>
+      <w:lvlJc w:val="left"/>
+      <w:pPr>
+        <w:tabs>
+          <w:tab w:val="num" w:pos="5760"/>
+        </w:tabs>
+        <w:ind w:left="5760" w:hanging="360"/>
+      </w:pPr>
+      <w:rPr>
+        <w:rFonts w:ascii="Wingdings" w:hAnsi="Wingdings" w:hint="default"/>
+        <w:sz w:val="20"/>
+      </w:rPr>
+    </w:lvl>
+    <w:lvl w:ilvl="8" w:tentative="1">
+      <w:start w:val="1"/>
+      <w:numFmt w:val="bullet"/>
+      <w:lvlText w:val=""/>
+      <w:lvlJc w:val="left"/>
+      <w:pPr>
+        <w:tabs>
+          <w:tab w:val="num" w:pos="6480"/>
+        </w:tabs>
+        <w:ind w:left="6480" w:hanging="360"/>
+      </w:pPr>
+      <w:rPr>
+        <w:rFonts w:ascii="Wingdings" w:hAnsi="Wingdings" w:hint="default"/>
+        <w:sz w:val="20"/>
+      </w:rPr>
+    </w:lvl>
+  </w:abstractNum>
+  <w:abstractNum w:abstractNumId="27" w15:restartNumberingAfterBreak="0">
     <w:nsid w:val="7E596B6C"/>
     <w:multiLevelType w:val="multilevel"/>
     <w:tmpl w:val="D94CE1A0"/>
@@ -6058,70 +7952,88 @@
     </w:lvl>
   </w:abstractNum>
   <w:num w:numId="1" w16cid:durableId="1266959649">
-    <w:abstractNumId w:val="20"/>
+    <w:abstractNumId w:val="25"/>
   </w:num>
   <w:num w:numId="2" w16cid:durableId="1182161811">
-    <w:abstractNumId w:val="11"/>
+    <w:abstractNumId w:val="14"/>
   </w:num>
   <w:num w:numId="3" w16cid:durableId="1039361466">
-    <w:abstractNumId w:val="12"/>
+    <w:abstractNumId w:val="16"/>
   </w:num>
   <w:num w:numId="4" w16cid:durableId="801311620">
-    <w:abstractNumId w:val="18"/>
+    <w:abstractNumId w:val="23"/>
   </w:num>
   <w:num w:numId="5" w16cid:durableId="1234120903">
-    <w:abstractNumId w:val="16"/>
+    <w:abstractNumId w:val="21"/>
   </w:num>
   <w:num w:numId="6" w16cid:durableId="2040813871">
     <w:abstractNumId w:val="0"/>
   </w:num>
   <w:num w:numId="7" w16cid:durableId="1687948177">
+    <w:abstractNumId w:val="4"/>
+  </w:num>
+  <w:num w:numId="8" w16cid:durableId="2122996057">
+    <w:abstractNumId w:val="2"/>
+  </w:num>
+  <w:num w:numId="9" w16cid:durableId="1116946554">
+    <w:abstractNumId w:val="19"/>
+  </w:num>
+  <w:num w:numId="10" w16cid:durableId="111098467">
+    <w:abstractNumId w:val="13"/>
+  </w:num>
+  <w:num w:numId="11" w16cid:durableId="1078215231">
+    <w:abstractNumId w:val="8"/>
+  </w:num>
+  <w:num w:numId="12" w16cid:durableId="1857189314">
+    <w:abstractNumId w:val="7"/>
+  </w:num>
+  <w:num w:numId="13" w16cid:durableId="1970164400">
+    <w:abstractNumId w:val="17"/>
+  </w:num>
+  <w:num w:numId="14" w16cid:durableId="961497878">
+    <w:abstractNumId w:val="27"/>
+  </w:num>
+  <w:num w:numId="15" w16cid:durableId="138115254">
+    <w:abstractNumId w:val="12"/>
+  </w:num>
+  <w:num w:numId="16" w16cid:durableId="1740907428">
     <w:abstractNumId w:val="3"/>
   </w:num>
-  <w:num w:numId="8" w16cid:durableId="2122996057">
+  <w:num w:numId="17" w16cid:durableId="1874414662">
+    <w:abstractNumId w:val="11"/>
+  </w:num>
+  <w:num w:numId="18" w16cid:durableId="1859352286">
+    <w:abstractNumId w:val="22"/>
+  </w:num>
+  <w:num w:numId="19" w16cid:durableId="969474709">
+    <w:abstractNumId w:val="20"/>
+  </w:num>
+  <w:num w:numId="20" w16cid:durableId="1119758751">
+    <w:abstractNumId w:val="10"/>
+  </w:num>
+  <w:num w:numId="21" w16cid:durableId="1389113741">
+    <w:abstractNumId w:val="24"/>
+  </w:num>
+  <w:num w:numId="22" w16cid:durableId="820461471">
+    <w:abstractNumId w:val="5"/>
+  </w:num>
+  <w:num w:numId="23" w16cid:durableId="396711409">
+    <w:abstractNumId w:val="15"/>
+  </w:num>
+  <w:num w:numId="24" w16cid:durableId="1800218892">
+    <w:abstractNumId w:val="9"/>
+  </w:num>
+  <w:num w:numId="25" w16cid:durableId="1111051288">
+    <w:abstractNumId w:val="26"/>
+  </w:num>
+  <w:num w:numId="26" w16cid:durableId="1063216069">
     <w:abstractNumId w:val="1"/>
   </w:num>
-  <w:num w:numId="9" w16cid:durableId="1116946554">
-    <w:abstractNumId w:val="14"/>
-  </w:num>
-  <w:num w:numId="10" w16cid:durableId="111098467">
-    <w:abstractNumId w:val="10"/>
-  </w:num>
-  <w:num w:numId="11" w16cid:durableId="1078215231">
+  <w:num w:numId="27" w16cid:durableId="1074743232">
     <w:abstractNumId w:val="6"/>
   </w:num>
-  <w:num w:numId="12" w16cid:durableId="1857189314">
-    <w:abstractNumId w:val="5"/>
-  </w:num>
-  <w:num w:numId="13" w16cid:durableId="1970164400">
-    <w:abstractNumId w:val="13"/>
-  </w:num>
-  <w:num w:numId="14" w16cid:durableId="961497878">
-    <w:abstractNumId w:val="21"/>
-  </w:num>
-  <w:num w:numId="15" w16cid:durableId="138115254">
-    <w:abstractNumId w:val="9"/>
-  </w:num>
-  <w:num w:numId="16" w16cid:durableId="1740907428">
-    <w:abstractNumId w:val="2"/>
-  </w:num>
-  <w:num w:numId="17" w16cid:durableId="1874414662">
-    <w:abstractNumId w:val="8"/>
-  </w:num>
-  <w:num w:numId="18" w16cid:durableId="1859352286">
-    <w:abstractNumId w:val="17"/>
-  </w:num>
-  <w:num w:numId="19" w16cid:durableId="969474709">
-    <w:abstractNumId w:val="15"/>
-  </w:num>
-  <w:num w:numId="20" w16cid:durableId="1119758751">
-    <w:abstractNumId w:val="7"/>
-  </w:num>
-  <w:num w:numId="21" w16cid:durableId="1389113741">
-    <w:abstractNumId w:val="19"/>
-  </w:num>
-  <w:num w:numId="22" w16cid:durableId="820461471">
-    <w:abstractNumId w:val="4"/>
+  <w:num w:numId="28" w16cid:durableId="445393880">
+    <w:abstractNumId w:val="18"/>
   </w:num>
 </w:numbering>
 </file>
@@ -6730,7 +8642,6 @@
   <w:style w:type="character" w:default="1" w:styleId="Fuentedeprrafopredeter">
     <w:name w:val="Default Paragraph Font"/>
     <w:uiPriority w:val="1"/>
-    <w:semiHidden/>
     <w:unhideWhenUsed/>
   </w:style>
   <w:style w:type="table" w:default="1" w:styleId="Tablanormal">

</xml_diff>